<commit_message>
documentazione docx e pdf della relazione tecnica
</commit_message>
<xml_diff>
--- a/documents/RelazioneTecnica_GazzanoTommaso.docx
+++ b/documents/RelazioneTecnica_GazzanoTommaso.docx
@@ -1762,23 +1762,7 @@
             <w:rFonts w:ascii="Times New Roman" w:hAnsi="Times New Roman"/>
             <w:noProof/>
           </w:rPr>
-          <w:t xml:space="preserve">Package </w:t>
-        </w:r>
-        <w:r>
-          <w:rPr>
-            <w:rStyle w:val="Collegamentoipertestuale"/>
-            <w:rFonts w:ascii="Times New Roman" w:hAnsi="Times New Roman"/>
-            <w:noProof/>
-          </w:rPr>
-          <w:t>U</w:t>
-        </w:r>
-        <w:r>
-          <w:rPr>
-            <w:rStyle w:val="Collegamentoipertestuale"/>
-            <w:rFonts w:ascii="Times New Roman" w:hAnsi="Times New Roman"/>
-            <w:noProof/>
-          </w:rPr>
-          <w:t>I</w:t>
+          <w:t>Package UI</w:t>
         </w:r>
         <w:r>
           <w:rPr>
@@ -2670,23 +2654,7 @@
             <w:rFonts w:ascii="Times New Roman" w:hAnsi="Times New Roman"/>
             <w:noProof/>
           </w:rPr>
-          <w:t>Valutaz</w:t>
-        </w:r>
-        <w:r>
-          <w:rPr>
-            <w:rStyle w:val="Collegamentoipertestuale"/>
-            <w:rFonts w:ascii="Times New Roman" w:hAnsi="Times New Roman"/>
-            <w:noProof/>
-          </w:rPr>
-          <w:t>i</w:t>
-        </w:r>
-        <w:r>
-          <w:rPr>
-            <w:rStyle w:val="Collegamentoipertestuale"/>
-            <w:rFonts w:ascii="Times New Roman" w:hAnsi="Times New Roman"/>
-            <w:noProof/>
-          </w:rPr>
-          <w:t>one del risultati</w:t>
+          <w:t>Valutazione del risultati</w:t>
         </w:r>
         <w:r>
           <w:rPr>
@@ -2966,6 +2934,9 @@
       <w:r>
         <w:t>Retailer Affinity Network: Modellazione a grafo delle affinità tra rivenditori e identificazione di cluster forti e deboli per il supporto alle decisioni commerciali</w:t>
       </w:r>
+      <w:r>
+        <w:t>.</w:t>
+      </w:r>
     </w:p>
     <w:p>
       <w:pPr>
@@ -3001,7 +2972,13 @@
         <w:t xml:space="preserve">L’analisi proposta ha un forte valore gestionale perché fornisce strumenti per segmentare e </w:t>
       </w:r>
       <w:r>
-        <w:t>comprendere meglio la rete dei rivenditori. Identificare catene di affinità permette ad un’azienda di pianificare campagne promozionali mirate, selezionare partner strategici, anticipare le mosse dei concorrenti e rilevare aree di isolamento commerciale. Inoltre, l’individuazione delle sequenze “deboli” consente di formulare raccomandazioni operative, ad esempio suggerendo un ampliamento dell’assortimento o l’ingresso in nuove categorie di prodotto per rafforzare la posizione di mercato. Si tratta quindi di un supporto decisionale utile per la pianificazione strategica e commerciale.</w:t>
+        <w:t>comprendere meglio la rete dei rivenditori. Identificare catene di affinità permette a un’azienda di pianificare campagne promozionali mirate</w:t>
+      </w:r>
+      <w:r>
+        <w:t xml:space="preserve"> e </w:t>
+      </w:r>
+      <w:r>
+        <w:t>rilevare aree di isolamento commerciale. Inoltre, l’individuazione delle sequenze “deboli” consente di formulare raccomandazioni operative, ad esempio suggerendo un ampliamento dell’assortimento o l’ingresso in nuove categorie di prodotto per rafforzare la posizione di mercato. Si tratta quindi di un supporto decisionale utile per la pianificazione strategica e commerciale.</w:t>
       </w:r>
     </w:p>
     <w:p>
@@ -3133,7 +3110,21 @@
     </w:p>
     <w:p>
       <w:r>
-        <w:t xml:space="preserve">L’applicazione presenta una GUI sviluppata in Python, tramite libreria Flet, organizzata secondo il pattern MVC. L’utente ha la possibilità di selezionare dei filtri, quali la </w:t>
+        <w:t>L’applicazione presenta una GUI sviluppata in Python</w:t>
+      </w:r>
+      <w:r>
+        <w:t xml:space="preserve"> </w:t>
+      </w:r>
+      <w:r>
+        <w:t xml:space="preserve">tramite libreria </w:t>
+      </w:r>
+      <w:proofErr w:type="spellStart"/>
+      <w:r>
+        <w:t>Flet</w:t>
+      </w:r>
+      <w:proofErr w:type="spellEnd"/>
+      <w:r>
+        <w:t xml:space="preserve">, organizzata secondo il pattern MVC. L’utente ha la possibilità di selezionare dei filtri, quali la </w:t>
       </w:r>
       <w:r>
         <w:t>t</w:t>
@@ -3362,7 +3353,13 @@
     </w:p>
     <w:p>
       <w:r>
-        <w:t xml:space="preserve">D’altra parte, il modello presenta diverse potenzialità, in quanto consente di rappresentare in modo strutturato le relazioni tra i rivenditori e di evidenziare schemi non immediatamente osservabili nei dati. La flessibilità dell’approccio permette inoltre di estenderlo introducendo ulteriori vincoli e parametri di analisi. In prospettiva, il modello potrebbe essere integrato con tecniche di intelligenza artificiale per individuare pattern nascosti o supportare analisi predittive, ampliandone ulteriormente le capacità applicative. </w:t>
+        <w:t xml:space="preserve">D’altra parte, il modello presenta diverse potenzialità, in quanto consente di rappresentare in modo strutturato le relazioni tra i rivenditori e di evidenziare schemi non immediatamente osservabili nei dati. La flessibilità dell’approccio permette inoltre di estenderlo introducendo ulteriori vincoli e parametri di analisi. In prospettiva, il modello potrebbe essere integrato con tecniche di </w:t>
+      </w:r>
+      <w:r>
+        <w:t>machine learning</w:t>
+      </w:r>
+      <w:r>
+        <w:t xml:space="preserve"> per individuare pattern nascosti o supportare analisi predittive, ampliandone ulteriormente le capacità applicative. </w:t>
       </w:r>
     </w:p>
     <w:p>
@@ -4281,7 +4278,7 @@
         <w:t>DAO.py</w:t>
       </w:r>
       <w:r>
-        <w:t>: classe che contiene tutti i metodi necessari per estrarre dal database i dati necessari alla costruzione del grafo e l’esecuzione degli algoritmi.</w:t>
+        <w:t>: classe che contiene tutti i metodi per estrarre dal database i dati necessari alla costruzione del grafo e l’esecuzione degli algoritmi.</w:t>
       </w:r>
     </w:p>
     <w:p>
@@ -4296,7 +4293,13 @@
     </w:p>
     <w:p>
       <w:r>
-        <w:t>All’interno del package model si trovano tutte le classi necessarie alla realizzazione della logica applicativa del software. In esso troviamo:</w:t>
+        <w:t xml:space="preserve">All’interno del package model si trovano tutte le classi necessarie alla realizzazione della logica applicativa del software. In esso </w:t>
+      </w:r>
+      <w:r>
+        <w:t>si trovano i file</w:t>
+      </w:r>
+      <w:r>
+        <w:t>:</w:t>
       </w:r>
     </w:p>
     <w:p>
@@ -5036,7 +5039,13 @@
       </w:r>
       <w:r>
         <w:lastRenderedPageBreak/>
-        <w:t>versione dell’immagine del grafo, nella quale viene evidenziato il cammino individuato. In particolare, il percorso vincente viene rappresentato in verde, mentre quello debole in rosso, per facilitare l’interpretazione del risultati.</w:t>
+        <w:t>versione dell’immagine del grafo, nella quale viene evidenziato il cammino individuato. In particolare, il percorso vincente viene rappresentato in verde, mentre quello debole in rosso, per facilitare l’interpretazione de</w:t>
+      </w:r>
+      <w:r>
+        <w:t xml:space="preserve">i </w:t>
+      </w:r>
+      <w:r>
+        <w:t>risultati.</w:t>
       </w:r>
     </w:p>
     <w:p>
@@ -5414,7 +5423,7 @@
         <w:t xml:space="preserve">’applicazione, l’interfaccia grafica </w:t>
       </w:r>
       <w:r>
-        <w:t xml:space="preserve">consente </w:t>
+        <w:t>consente</w:t>
       </w:r>
       <w:r>
         <w:t xml:space="preserve"> </w:t>
@@ -5465,7 +5474,13 @@
         <w:t>avvia la generazione</w:t>
       </w:r>
       <w:r>
-        <w:t xml:space="preserve"> il grafo</w:t>
+        <w:t xml:space="preserve"> </w:t>
+      </w:r>
+      <w:r>
+        <w:t>de</w:t>
+      </w:r>
+      <w:r>
+        <w:t>l grafo</w:t>
       </w:r>
       <w:r>
         <w:t xml:space="preserve"> e la sua visualizzazione</w:t>
@@ -5492,7 +5507,13 @@
         <w:t>ulteriori filtri necessari all’esecuzione degli algoritmi ricorsivi</w:t>
       </w:r>
       <w:r>
-        <w:t>, i cui risultati vengono mostrati nell’aria sottostante.</w:t>
+        <w:t>, i cui risultati vengono mostrati nell’ar</w:t>
+      </w:r>
+      <w:r>
+        <w:t>ea</w:t>
+      </w:r>
+      <w:r>
+        <w:t xml:space="preserve"> sottostante.</w:t>
       </w:r>
     </w:p>
     <w:p>
@@ -5528,6 +5549,9 @@
         <w:jc w:val="center"/>
       </w:pPr>
       <w:r>
+        <w:rPr>
+          <w:noProof/>
+        </w:rPr>
         <w:drawing>
           <wp:inline distT="0" distB="0" distL="0" distR="0" wp14:anchorId="34AA324F" wp14:editId="0B3DE1AB">
             <wp:extent cx="5219700" cy="3822700"/>
@@ -5646,7 +5670,13 @@
       </w:r>
       <w:proofErr w:type="spellEnd"/>
       <w:r>
-        <w:t xml:space="preserve"> Store”, intervallo temporale compreso tra il 22/12/2015 – 22/12/2018, soglia di Affinità uguale a 4, si ottiene il seguente grafo.</w:t>
+        <w:t xml:space="preserve"> Store”, intervallo temporale compreso tra il 22/12/2015 – 22/12/2018, soglia di </w:t>
+      </w:r>
+      <w:r>
+        <w:t>a</w:t>
+      </w:r>
+      <w:r>
+        <w:t>ffinità uguale a 4, si ottiene il seguente grafo.</w:t>
       </w:r>
     </w:p>
     <w:p>
@@ -5654,6 +5684,9 @@
         <w:keepNext/>
       </w:pPr>
       <w:r>
+        <w:rPr>
+          <w:noProof/>
+        </w:rPr>
         <w:drawing>
           <wp:inline distT="0" distB="0" distL="0" distR="0" wp14:anchorId="2096BE40" wp14:editId="42D46E3A">
             <wp:extent cx="5219700" cy="3822700"/>
@@ -5759,10 +5792,22 @@
         <w:t>,</w:t>
       </w:r>
       <w:r>
-        <w:t xml:space="preserve"> lunghezza 5</w:t>
-      </w:r>
-      <w:r>
-        <w:t xml:space="preserve"> e la ricerca del cammino vincente </w:t>
+        <w:t xml:space="preserve"> lunghezza </w:t>
+      </w:r>
+      <w:r>
+        <w:t xml:space="preserve">massima pari a </w:t>
+      </w:r>
+      <w:r>
+        <w:t>5</w:t>
+      </w:r>
+      <w:r>
+        <w:t xml:space="preserve"> </w:t>
+      </w:r>
+      <w:r>
+        <w:t xml:space="preserve">ed eseguendo la </w:t>
+      </w:r>
+      <w:r>
+        <w:t xml:space="preserve">ricerca del cammino vincente </w:t>
       </w:r>
       <w:r>
         <w:t xml:space="preserve">si ottengono </w:t>
@@ -5825,6 +5870,9 @@
         <w:t xml:space="preserve"> </w:t>
       </w:r>
       <w:r>
+        <w:rPr>
+          <w:noProof/>
+        </w:rPr>
         <w:drawing>
           <wp:inline distT="0" distB="0" distL="0" distR="0" wp14:anchorId="23A5B345" wp14:editId="2E7117B8">
             <wp:extent cx="5219700" cy="3822700"/>
@@ -5941,6 +5989,9 @@
         <w:t xml:space="preserve"> </w:t>
       </w:r>
       <w:r>
+        <w:rPr>
+          <w:noProof/>
+        </w:rPr>
         <w:drawing>
           <wp:inline distT="0" distB="0" distL="0" distR="0" wp14:anchorId="59B68A1F" wp14:editId="13965AE2">
             <wp:extent cx="5219700" cy="3874770"/>
@@ -6050,21 +6101,15 @@
       <w:pPr>
         <w:pStyle w:val="Titolo2"/>
       </w:pPr>
-      <w:bookmarkStart w:id="44" w:name="_Toc228441787"/>
-      <w:bookmarkStart w:id="45" w:name="_Toc228441788"/>
+      <w:bookmarkStart w:id="44" w:name="_Toc228441788"/>
+      <w:bookmarkStart w:id="45" w:name="_Toc228441787"/>
       <w:r>
         <w:t>Limiti dell’applicazione</w:t>
       </w:r>
     </w:p>
     <w:p>
       <w:r>
-        <w:t>La complessità degli algoritmi utilizzati cresce rapidamente con l’aumentare dei nodi e delle lunghezze dei cammini, rendendo necessario imporre vincoli per mantenere i tempi di esecuzione accettabili. Inoltre</w:t>
-      </w:r>
-      <w:r>
-        <w:t xml:space="preserve">, </w:t>
-      </w:r>
-      <w:r>
-        <w:t>i risultati dipendono in modo significativo dai parametri scelti e da</w:t>
+        <w:t>La complessità degli algoritmi utilizzati cresce rapidamente con l’aumentare dei nodi e delle lunghezze dei cammini, rendendo necessario imporre vincoli per mantenere i tempi di esecuzione accettabili. Inoltre, i risultati dipendono in modo significativo dai parametri scelti e da</w:t>
       </w:r>
       <w:r>
         <w:t xml:space="preserve">lla qualità dei </w:t>
@@ -6097,30 +6142,50 @@
       <w:r>
         <w:t>Valutazione del risultati</w:t>
       </w:r>
+      <w:bookmarkEnd w:id="44"/>
+    </w:p>
+    <w:p>
+      <w:r>
+        <w:t xml:space="preserve">Il lavoro svolto ha mostrato come l’utilizzo di un modello a grafo possa essere efficiente per analizzare le relazioni tra rivenditori a partire dai dati di vendita. La costruzione della rete ha permesso di </w:t>
+      </w:r>
+      <w:r>
+        <w:t>rappresentare in modo chiaro le connessioni tra i diversi attori. L’utilizzo di algoritmi ricorsivi ha reso possibile approfondire ulteriormente l’analisi, individuando sequenze di rivenditori caratterizzate da relazioni forti o deboli. In particolare, il “cammino vincente” ha evidenziato catene più coese all’interno della rete, mentre il “cammino debole” ha permesso di individuare situazioni meno consolidate, potenzialmente utili per valutare interventi di miglioramento.</w:t>
+      </w:r>
+    </w:p>
+    <w:p>
+      <w:r>
+        <w:t>Dal punto di vista applicativo</w:t>
+      </w:r>
+      <w:r>
+        <w:t>,</w:t>
+      </w:r>
+      <w:r>
+        <w:t xml:space="preserve"> i risultati ottenuti possono essere utili per supportare alcune decisioni operative, quali la gestione dell’assortimento o l’individuazione di prodotti su cui investire maggiormente. L’analisi dei prodotti più frequenti e meno frequenti lungo i cammini individuati aggiunge infatti un livello di dettaglio che rende l’interpretazione dei risultati più concreta. </w:t>
+      </w:r>
+    </w:p>
+    <w:p>
+      <w:pPr>
+        <w:spacing w:line="278" w:lineRule="auto"/>
+        <w:jc w:val="left"/>
+        <w:rPr>
+          <w:b/>
+          <w:bCs/>
+          <w:sz w:val="40"/>
+          <w:szCs w:val="40"/>
+        </w:rPr>
+      </w:pPr>
+      <w:bookmarkStart w:id="46" w:name="_Toc228441789"/>
       <w:bookmarkEnd w:id="45"/>
-    </w:p>
-    <w:p>
-      <w:r>
-        <w:t xml:space="preserve">Il lavoro svolto ha mostrato come l’utilizzo di un modello a grafo possa essere efficiente per analizzare le relazioni tra rivenditori a partire dai dati di vendita. La costruzione della rete ha permesso di </w:t>
-      </w:r>
-      <w:r>
-        <w:t>rappresentare in modo chiaro le connessioni tra i diversi attori. L’utilizzo di algoritmi ricorsivi ha reso possibile approfondire ulteriormente l’analisi, individuando sequenze di rivenditori caratterizzate da relazioni forti o deboli. In particolare, il “cammino vincente” ha evidenziato catene più coese all’interno della rete, mentre il “cammino debole” ha permesso di individuare situazioni meno consolidate, potenzialmente utili per valutare interventi di miglioramento.</w:t>
-      </w:r>
-    </w:p>
-    <w:p>
-      <w:r>
-        <w:t xml:space="preserve">Dal punto di vista applicativo i risultati ottenuti possono essere utili per supportare alcune decisioni operative, quali la gestione dell’assortimento o l’individuazione di prodotti su cui investire maggiormente. L’analisi dei prodotti più frequenti e meno frequenti lungo i cammini individuati aggiunge infatti un livello di dettaglio che rende l’interpretazione dei risultati più concreta. </w:t>
-      </w:r>
-    </w:p>
-    <w:bookmarkEnd w:id="44"/>
-    <w:p/>
-    <w:p/>
+      <w:r>
+        <w:br w:type="page"/>
+      </w:r>
+    </w:p>
     <w:p>
       <w:pPr>
         <w:pStyle w:val="Titolo1"/>
       </w:pPr>
-      <w:bookmarkStart w:id="46" w:name="_Toc228441789"/>
-      <w:r>
+      <w:r>
+        <w:lastRenderedPageBreak/>
         <w:t>Licenza</w:t>
       </w:r>
       <w:bookmarkEnd w:id="46"/>
@@ -6134,19 +6199,7 @@
           <w:rPr>
             <w:rStyle w:val="Collegamentoipertestuale"/>
           </w:rPr>
-          <w:t>https://opensource.org/li</w:t>
-        </w:r>
-        <w:r>
-          <w:rPr>
-            <w:rStyle w:val="Collegamentoipertestuale"/>
-          </w:rPr>
-          <w:t>c</w:t>
-        </w:r>
-        <w:r>
-          <w:rPr>
-            <w:rStyle w:val="Collegamentoipertestuale"/>
-          </w:rPr>
-          <w:t>ense/MIT</w:t>
+          <w:t>https://opensource.org/license/MIT</w:t>
         </w:r>
       </w:hyperlink>
     </w:p>

</xml_diff>